<commit_message>
Add GitHub repository link to lab question 2 write-up
</commit_message>
<xml_diff>
--- a/Topic 8 Lab Question 2.docx
+++ b/Topic 8 Lab Question 2.docx
@@ -966,8 +966,16 @@
         <w:spacing w:after="160"/>
       </w:pPr>
       <w:r>
-        <w:t xml:space="preserve">Repository link: &lt;add link after upload&gt;</w:t>
-      </w:r>
+        <w:t xml:space="preserve">Repository link: </w:t>
+      </w:r>
+      <w:hyperlink w:history="1" r:id="rIdu9gnlakj3mfjkb_kmeurg">
+        <w:r>
+          <w:rPr>
+            <w:rStyle w:val="Hyperlink"/>
+          </w:rPr>
+          <w:t xml:space="preserve">https://github.com/ChrisLuciano2/cst310-topic8-lab-question-2</w:t>
+        </w:r>
+      </w:hyperlink>
     </w:p>
     <w:sectPr>
       <w:pgSz w:w="12240" w:h="15840" w:orient="portrait"/>

</xml_diff>